<commit_message>
feat: 🔑 Punto de oro
</commit_message>
<xml_diff>
--- a/docs/epica-4/HU-022-MAPA-TECNICO-INGRESAR-AULA.docx
+++ b/docs/epica-4/HU-022-MAPA-TECNICO-INGRESAR-AULA.docx
@@ -708,6 +708,54 @@
           <w:szCs w:val="21"/>
         </w:rPr>
         <w:t xml:space="preserve">  equipo antes de nombrar las clases CSS (ver la guía de maquetación).</w:t>
+      </w:r>
+    </w:p>
+    <w:p>
+      <w:r>
+        <w:t>Esta historia es la base: HU-023 y HU-026 no esperan a que termines todo, solo necesitan dos cosas tuyas, lo antes posible, no al final:</w:t>
+      </w:r>
+    </w:p>
+    <w:p>
+      <w:r>
+        <w:t>1. Avisar apenas el esqueleto est? en develop (AulaControlador, AulaServicio con motivoSinAccesoPublico(Matricula m), y aula.ts/aula.html con la estructura base) ? ese aviso es lo que les permite a los otros dos equipos empezar a integrar en serio. No hace falta que est? terminada la historia completa, solo ese esqueleto.</w:t>
+      </w:r>
+    </w:p>
+    <w:p>
+      <w:r>
+        <w:t>2. Acordar con el equipo de HU-026 (Gabriel y Ariana) los nombres de las clases CSS de la tarjeta de sesi?n en vivo antes de maquetar ? es una conversaci?n corta, no un bloqueo.</w:t>
+      </w:r>
+    </w:p>
+    <w:p>
+      <w:r>
+        <w:t>Mientras tanto, HU-023 y HU-026 ya pueden programar contra el contrato de motivoSinAccesoPublico (nombre y firma est?n definidos abajo) sin esperarte, usando un stub local temporal si necesitan compilar antes de tu merge.</w:t>
+      </w:r>
+    </w:p>
+    <w:p>
+      <w:pPr>
+        <w:pStyle w:val="Heading1"/>
+      </w:pPr>
+      <w:r>
+        <w:t>🔑 Punto de oro — con quién coordinar</w:t>
+      </w:r>
+    </w:p>
+    <w:p>
+      <w:r>
+        <w:t>Esta historia es la base: HU-023 y HU-026 no esperan a que termines todo, solo necesitan dos cosas tuyas, lo antes posible, no al final:</w:t>
+      </w:r>
+    </w:p>
+    <w:p>
+      <w:r>
+        <w:t>1. Avisar apenas el esqueleto esté en develop (AulaControlador, AulaServicio con motivoSinAccesoPublico(Matricula m), y aula.ts/aula.html con la estructura base) — ese aviso es lo que les permite a los otros dos equipos empezar a integrar en serio. No hace falta que esté terminada la historia completa, solo ese esqueleto.</w:t>
+      </w:r>
+    </w:p>
+    <w:p>
+      <w:r>
+        <w:t>2. Acordar con el equipo de HU-026 (Gabriel y Ariana) los nombres de las clases CSS de la tarjeta de sesión en vivo antes de maquetar — es una conversación corta, no un bloqueo.</w:t>
+      </w:r>
+    </w:p>
+    <w:p>
+      <w:r>
+        <w:t>Mientras tanto, HU-023 y HU-026 ya pueden programar contra el contrato de motivoSinAccesoPublico (nombre y firma están definidos abajo) sin esperarte, usando un stub local temporal si necesitan compilar antes de tu merge.</w:t>
       </w:r>
     </w:p>
     <w:p>

</xml_diff>